<commit_message>
task 2,12,14 alligment fix
</commit_message>
<xml_diff>
--- a/bank/task_02/variant_01.docx
+++ b/bank/task_02/variant_01.docx
@@ -2,6 +2,158 @@
 <file path=word/document.xml><?xml version="1.0" encoding="utf-8"?>
 <w:document xmlns:wpc="http://schemas.microsoft.com/office/word/2010/wordprocessingCanvas" xmlns:cx="http://schemas.microsoft.com/office/drawing/2014/chartex" xmlns:cx1="http://schemas.microsoft.com/office/drawing/2015/9/8/chartex" xmlns:cx2="http://schemas.microsoft.com/office/drawing/2015/10/21/chartex" xmlns:cx3="http://schemas.microsoft.com/office/drawing/2016/5/9/chartex" xmlns:cx4="http://schemas.microsoft.com/office/drawing/2016/5/10/chartex" xmlns:cx5="http://schemas.microsoft.com/office/drawing/2016/5/11/chartex" xmlns:cx6="http://schemas.microsoft.com/office/drawing/2016/5/12/chartex" xmlns:cx7="http://schemas.microsoft.com/office/drawing/2016/5/13/chartex" xmlns:cx8="http://schemas.microsoft.com/office/drawing/2016/5/14/chartex" xmlns:mc="http://schemas.openxmlformats.org/markup-compatibility/2006" xmlns:aink="http://schemas.microsoft.com/office/drawing/2016/ink" xmlns:am3d="http://schemas.microsoft.com/office/drawing/2017/model3d" xmlns:o="urn:schemas-microsoft-com:office:office" xmlns:r="http://schemas.openxmlformats.org/officeDocument/2006/relationships" xmlns:m="http://schemas.openxmlformats.org/officeDocument/2006/math" xmlns:v="urn:schemas-microsoft-com:vml" xmlns:wp14="http://schemas.microsoft.com/office/word/2010/wordprocessingDrawing" xmlns:wp="http://schemas.openxmlformats.org/drawingml/2006/wordprocessingDrawing" xmlns:w10="urn:schemas-microsoft-com:office:word" xmlns:w="http://schemas.openxmlformats.org/wordprocessingml/2006/main" xmlns:w14="http://schemas.microsoft.com/office/word/2010/wordml" xmlns:w15="http://schemas.microsoft.com/office/word/2012/wordml" xmlns:w16cex="http://schemas.microsoft.com/office/word/2018/wordml/cex" xmlns:w16cid="http://schemas.microsoft.com/office/word/2016/wordml/cid" xmlns:w16="http://schemas.microsoft.com/office/word/2018/wordml" xmlns:w16sdtdh="http://schemas.microsoft.com/office/word/2020/wordml/sdtdatahash" xmlns:w16se="http://schemas.microsoft.com/office/word/2015/wordml/symex" xmlns:wpg="http://schemas.microsoft.com/office/word/2010/wordprocessingGroup" xmlns:wpi="http://schemas.microsoft.com/office/word/2010/wordprocessingInk" xmlns:wne="http://schemas.microsoft.com/office/word/2006/wordml" xmlns:wps="http://schemas.microsoft.com/office/word/2010/wordprocessingShape" mc:Ignorable="w14 w15 w16se w16cid w16 w16cex w16sdtdh wp14">
   <w:body>
+    <w:tbl>
+      <w:tblPr>
+        <w:tblStyle w:val="a3"/>
+        <w:tblW w:w="5000" w:type="pct"/>
+        <w:tblBorders>
+          <w:top w:val="none" w:sz="0" w:space="0" w:color="auto"/>
+          <w:left w:val="none" w:sz="0" w:space="0" w:color="auto"/>
+          <w:bottom w:val="none" w:sz="0" w:space="0" w:color="auto"/>
+          <w:right w:val="none" w:sz="0" w:space="0" w:color="auto"/>
+          <w:insideH w:val="none" w:sz="0" w:space="0" w:color="auto"/>
+          <w:insideV w:val="none" w:sz="0" w:space="0" w:color="auto"/>
+        </w:tblBorders>
+        <w:tblLook w:val="04A0" w:firstRow="1" w:lastRow="0" w:firstColumn="1" w:lastColumn="0" w:noHBand="0" w:noVBand="1"/>
+      </w:tblPr>
+      <w:tblGrid>
+        <w:gridCol w:w="4176"/>
+        <w:gridCol w:w="6030"/>
+      </w:tblGrid>
+      <w:tr>
+        <w:tc>
+          <w:tcPr>
+            <w:tcW w:w="2500" w:type="pct"/>
+            <w:shd w:val="clear" w:color="auto" w:fill="auto"/>
+            <w:tcMar>
+              <w:left w:w="85" w:type="dxa"/>
+              <w:right w:w="85" w:type="dxa"/>
+            </w:tcMar>
+          </w:tcPr>
+          <w:p>
+            <w:pPr>
+              <w:pStyle w:val="ds-markdown-paragraph"/>
+              <w:spacing w:before="0" w:beforeAutospacing="0" w:after="0" w:afterAutospacing="0"/>
+              <w:rPr>
+                <w:bCs/>
+                <w:szCs w:val="28"/>
+              </w:rPr>
+            </w:pPr>
+            <w:r>
+              <w:rPr>
+                <w:bCs/>
+                <w:szCs w:val="28"/>
+              </w:rPr>
+              <w:t xml:space="preserve">Задание 2. (2) </w:t>
+            </w:r>
+          </w:p>
+          <w:p>
+            <w:pPr>
+              <w:pStyle w:val="ds-markdown-paragraph"/>
+              <w:spacing w:before="0" w:beforeAutospacing="0" w:after="0" w:afterAutospacing="0"/>
+              <w:rPr>
+                <w:szCs w:val="28"/>
+              </w:rPr>
+            </w:pPr>
+            <w:r>
+              <w:rPr>
+                <w:szCs w:val="28"/>
+              </w:rPr>
+              <w:t>На графике изображена зависимость атмосферного давления (в миллиметрах ртутного столба) от высоты над уровнем моря (в километрах). На какой высоте (в км) летит воздушный шар, если барометр, находящийся в корзине шара, показывает давление 340 миллиметров ртутного столба?</w:t>
+            </w:r>
+          </w:p>
+        </w:tc>
+        <w:tc>
+          <w:tcPr>
+            <w:tcW w:w="2500" w:type="pct"/>
+            <w:shd w:val="clear" w:color="auto" w:fill="auto"/>
+            <w:tcMar>
+              <w:left w:w="85" w:type="dxa"/>
+              <w:right w:w="85" w:type="dxa"/>
+            </w:tcMar>
+            <w:vAlign w:val="center"/>
+          </w:tcPr>
+          <w:p>
+            <w:pPr>
+              <w:pStyle w:val="ds-markdown-paragraph"/>
+              <w:spacing w:before="0" w:beforeAutospacing="0" w:after="0" w:afterAutospacing="0"/>
+              <w:rPr>
+                <w:szCs w:val="28"/>
+              </w:rPr>
+            </w:pPr>
+            <w:r>
+              <w:rPr>
+                <w:noProof/>
+              </w:rPr>
+              <w:drawing>
+                <wp:anchor distT="0" distB="0" distL="114300" distR="114300" simplePos="0" relativeHeight="251658240" behindDoc="0" locked="0" layoutInCell="1" allowOverlap="1" wp14:anchorId="77207A16" wp14:editId="609E613D">
+                  <wp:simplePos x="0" y="0"/>
+                  <wp:positionH relativeFrom="column">
+                    <wp:posOffset>92075</wp:posOffset>
+                  </wp:positionH>
+                  <wp:positionV relativeFrom="paragraph">
+                    <wp:posOffset>-2111375</wp:posOffset>
+                  </wp:positionV>
+                  <wp:extent cx="3721100" cy="2115185"/>
+                  <wp:effectExtent l="0" t="0" r="0" b="0"/>
+                  <wp:wrapSquare wrapText="bothSides"/>
+                  <wp:docPr id="1" name="Рисунок 1"/>
+                  <wp:cNvGraphicFramePr>
+                    <a:graphicFrameLocks xmlns:a="http://schemas.openxmlformats.org/drawingml/2006/main" noChangeAspect="1"/>
+                  </wp:cNvGraphicFramePr>
+                  <a:graphic xmlns:a="http://schemas.openxmlformats.org/drawingml/2006/main">
+                    <a:graphicData uri="http://schemas.openxmlformats.org/drawingml/2006/picture">
+                      <pic:pic xmlns:pic="http://schemas.openxmlformats.org/drawingml/2006/picture">
+                        <pic:nvPicPr>
+                          <pic:cNvPr id="1" name=""/>
+                          <pic:cNvPicPr/>
+                        </pic:nvPicPr>
+                        <pic:blipFill>
+                          <a:blip r:embed="rId4">
+                            <a:extLst>
+                              <a:ext uri="{BEBA8EAE-BF5A-486C-A8C5-ECC9F3942E4B}">
+                                <a14:imgProps xmlns:a14="http://schemas.microsoft.com/office/drawing/2010/main">
+                                  <a14:imgLayer r:embed="rId5">
+                                    <a14:imgEffect>
+                                      <a14:artisticPhotocopy/>
+                                    </a14:imgEffect>
+                                  </a14:imgLayer>
+                                </a14:imgProps>
+                              </a:ext>
+                              <a:ext uri="{28A0092B-C50C-407E-A947-70E740481C1C}">
+                                <a14:useLocalDpi xmlns:a14="http://schemas.microsoft.com/office/drawing/2010/main" val="0"/>
+                              </a:ext>
+                            </a:extLst>
+                          </a:blip>
+                          <a:stretch>
+                            <a:fillRect/>
+                          </a:stretch>
+                        </pic:blipFill>
+                        <pic:spPr>
+                          <a:xfrm>
+                            <a:off x="0" y="0"/>
+                            <a:ext cx="3721100" cy="2115185"/>
+                          </a:xfrm>
+                          <a:prstGeom prst="rect">
+                            <a:avLst/>
+                          </a:prstGeom>
+                        </pic:spPr>
+                      </pic:pic>
+                    </a:graphicData>
+                  </a:graphic>
+                  <wp14:sizeRelH relativeFrom="margin">
+                    <wp14:pctWidth>0</wp14:pctWidth>
+                  </wp14:sizeRelH>
+                  <wp14:sizeRelV relativeFrom="margin">
+                    <wp14:pctHeight>0</wp14:pctHeight>
+                  </wp14:sizeRelV>
+                </wp:anchor>
+              </w:drawing>
+            </w:r>
+          </w:p>
+        </w:tc>
+      </w:tr>
+    </w:tbl>
     <w:p>
       <w:pPr>
         <w:pStyle w:val="ds-markdown-paragraph"/>
@@ -10,90 +162,7 @@
           <w:szCs w:val="28"/>
         </w:rPr>
       </w:pPr>
-      <w:r>
-        <w:rPr>
-          <w:noProof/>
-        </w:rPr>
-        <w:drawing>
-          <wp:anchor distT="0" distB="0" distL="114300" distR="114300" simplePos="0" relativeHeight="251658240" behindDoc="0" locked="0" layoutInCell="1" allowOverlap="1" wp14:anchorId="77207A16" wp14:editId="4FBBC10B">
-            <wp:simplePos x="0" y="0"/>
-            <wp:positionH relativeFrom="column">
-              <wp:posOffset>3060700</wp:posOffset>
-            </wp:positionH>
-            <wp:positionV relativeFrom="paragraph">
-              <wp:posOffset>69850</wp:posOffset>
-            </wp:positionV>
-            <wp:extent cx="3581400" cy="2035904"/>
-            <wp:effectExtent l="0" t="0" r="0" b="2540"/>
-            <wp:wrapSquare wrapText="bothSides"/>
-            <wp:docPr id="1" name="Рисунок 1"/>
-            <wp:cNvGraphicFramePr>
-              <a:graphicFrameLocks xmlns:a="http://schemas.openxmlformats.org/drawingml/2006/main" noChangeAspect="1"/>
-            </wp:cNvGraphicFramePr>
-            <a:graphic xmlns:a="http://schemas.openxmlformats.org/drawingml/2006/main">
-              <a:graphicData uri="http://schemas.openxmlformats.org/drawingml/2006/picture">
-                <pic:pic xmlns:pic="http://schemas.openxmlformats.org/drawingml/2006/picture">
-                  <pic:nvPicPr>
-                    <pic:cNvPr id="1" name=""/>
-                    <pic:cNvPicPr/>
-                  </pic:nvPicPr>
-                  <pic:blipFill>
-                    <a:blip r:embed="rId4">
-                      <a:extLst>
-                        <a:ext uri="{BEBA8EAE-BF5A-486C-A8C5-ECC9F3942E4B}">
-                          <a14:imgProps xmlns:a14="http://schemas.microsoft.com/office/drawing/2010/main">
-                            <a14:imgLayer r:embed="rId5">
-                              <a14:imgEffect>
-                                <a14:artisticPhotocopy/>
-                              </a14:imgEffect>
-                            </a14:imgLayer>
-                          </a14:imgProps>
-                        </a:ext>
-                        <a:ext uri="{28A0092B-C50C-407E-A947-70E740481C1C}">
-                          <a14:useLocalDpi xmlns:a14="http://schemas.microsoft.com/office/drawing/2010/main" val="0"/>
-                        </a:ext>
-                      </a:extLst>
-                    </a:blip>
-                    <a:stretch>
-                      <a:fillRect/>
-                    </a:stretch>
-                  </pic:blipFill>
-                  <pic:spPr>
-                    <a:xfrm>
-                      <a:off x="0" y="0"/>
-                      <a:ext cx="3581400" cy="2035904"/>
-                    </a:xfrm>
-                    <a:prstGeom prst="rect">
-                      <a:avLst/>
-                    </a:prstGeom>
-                  </pic:spPr>
-                </pic:pic>
-              </a:graphicData>
-            </a:graphic>
-          </wp:anchor>
-        </w:drawing>
-      </w:r>
-      <w:r>
-        <w:rPr>
-          <w:bCs/>
-          <w:szCs w:val="28"/>
-        </w:rPr>
-        <w:t xml:space="preserve">Задание 2. (2) </w:t>
-      </w:r>
-      <w:r>
-        <w:rPr>
-          <w:szCs w:val="28"/>
-        </w:rPr>
-        <w:t>На графике изображена зависимость атмосферного давления (в миллиметрах ртутного столба) от высоты над уровнем моря (в километрах). На какой высоте (в км) летит воздушный шар, если барометр, находящийся в корзине шара, показывает давление 340 миллиметров ртутного столба?</w:t>
-      </w:r>
-      <w:r>
-        <w:rPr>
-          <w:szCs w:val="28"/>
-        </w:rPr>
-        <w:tab/>
-      </w:r>
     </w:p>
-    <w:p/>
     <w:sectPr>
       <w:pgSz w:w="11906" w:h="16838"/>
       <w:pgMar w:top="850" w:right="850" w:bottom="850" w:left="850" w:header="708" w:footer="708" w:gutter="0"/>
@@ -551,6 +620,25 @@
       <w:lang w:eastAsia="ru-RU"/>
     </w:rPr>
   </w:style>
+  <w:style w:type="table" w:styleId="a3">
+    <w:name w:val="Table Grid"/>
+    <w:basedOn w:val="a1"/>
+    <w:uiPriority w:val="39"/>
+    <w:rsid w:val="00B9121C"/>
+    <w:pPr>
+      <w:spacing w:after="0" w:line="240" w:lineRule="auto"/>
+    </w:pPr>
+    <w:tblPr>
+      <w:tblBorders>
+        <w:top w:val="single" w:sz="4" w:space="0" w:color="auto"/>
+        <w:left w:val="single" w:sz="4" w:space="0" w:color="auto"/>
+        <w:bottom w:val="single" w:sz="4" w:space="0" w:color="auto"/>
+        <w:right w:val="single" w:sz="4" w:space="0" w:color="auto"/>
+        <w:insideH w:val="single" w:sz="4" w:space="0" w:color="auto"/>
+        <w:insideV w:val="single" w:sz="4" w:space="0" w:color="auto"/>
+      </w:tblBorders>
+    </w:tblPr>
+  </w:style>
 </w:styles>
 </file>
 

</xml_diff>